<commit_message>
Agregar 5 paginas nuevas, README frontend completo y actualizar informe tecnico
Paginas nuevas: Boletas, Tickets, GestionTickets, SolicitarCita, MisCitasPaciente
README frontend: documentacion completa con paginas, RBAC, credenciales y API
Informe Word: credenciales actualizadas (jesus_admin/Admin@2024, aldair_santos,
paola_medina), 24 tablas, AuthController agregado en estructura del backend
</commit_message>
<xml_diff>
--- a/Informe_Tecnico_ClinicaAPI.docx
+++ b/Informe_Tecnico_ClinicaAPI.docx
@@ -278,7 +278,7 @@
         <w:rPr>
           <w:sz w:val="22"/>
         </w:rPr>
-        <w:t>La base de datos ClinicaDB contiene 23 tablas organizadas en 7 grupos funcionales, cubriendo desde la gestión de usuarios hasta facturación, historial clínico y auditoría.</w:t>
+        <w:t>La base de datos ClinicaDB contiene 24 tablas organizadas en 7 grupos funcionales, cubriendo desde la gestión de usuarios hasta facturación, historial clínico y auditoría.</w:t>
       </w:r>
     </w:p>
     <w:p>
@@ -1114,7 +1114,7 @@
         <w:rPr>
           <w:sz w:val="22"/>
         </w:rPr>
-        <w:t>Entidades mapeadas a las 23 tablas de ClinicaDB. El DbContext configura relaciones, claves foráneas y restricciones. El enum EstadoCita define los 5 estados posibles.</w:t>
+        <w:t>Entidades mapeadas a las 24 tablas de ClinicaDB. El DbContext configura relaciones, claves foráneas y restricciones. El enum EstadoCita define los 5 estados posibles.</w:t>
       </w:r>
     </w:p>
     <w:p>
@@ -1211,7 +1211,7 @@
         <w:rPr>
           <w:sz w:val="22"/>
         </w:rPr>
-        <w:t>La base de datos ClinicaDB (SQL Server, instancia REYMUNDO\SQL2025) contiene 23 tablas organizadas en 7 grupos funcionales con más de 20 relaciones de clave foránea.</w:t>
+        <w:t>La base de datos ClinicaDB (SQL Server, instancia REYMUNDO\SQL2025) contiene 24 tablas organizadas en 7 grupos funcionales con más de 20 relaciones de clave foránea.</w:t>
       </w:r>
     </w:p>
     <w:p>
@@ -3460,7 +3460,7 @@
               <w:rPr>
                 <w:sz w:val="20"/>
               </w:rPr>
-              <w:t>admin123</w:t>
+              <w:t>Admin@2024</w:t>
             </w:r>
           </w:p>
         </w:tc>
@@ -3502,7 +3502,7 @@
               <w:rPr>
                 <w:sz w:val="20"/>
               </w:rPr>
-              <w:t>medico123</w:t>
+              <w:t>Doctor@2024</w:t>
             </w:r>
           </w:p>
         </w:tc>
@@ -3545,7 +3545,7 @@
               <w:rPr>
                 <w:sz w:val="20"/>
               </w:rPr>
-              <w:t>cita123</w:t>
+              <w:t>Paciente123</w:t>
             </w:r>
           </w:p>
         </w:tc>
@@ -3595,7 +3595,7 @@
         <w:rPr>
           <w:sz w:val="22"/>
         </w:rPr>
-        <w:t>Dos paneles: branding izquierdo + formulario derecho. Tarjetas de acceso rápido con credenciales demo por rol. Estadísticas del sistema (23 tablas, 3 roles, REST .NET 8).</w:t>
+        <w:t>Dos paneles: branding izquierdo + formulario derecho. Tarjetas de acceso rápido con credenciales demo por rol. Estadísticas del sistema (24 tablas, 3 roles, REST .NET 8).</w:t>
       </w:r>
     </w:p>
     <w:p>
@@ -5123,7 +5123,7 @@
         <w:rPr>
           <w:sz w:val="22"/>
         </w:rPr>
-        <w:t>admin / admin123  →  Rol Administrador (acceso completo)</w:t>
+        <w:t>jesus_admin / Admin@2024  →  Rol Administrador (acceso completo)</w:t>
       </w:r>
     </w:p>
     <w:p>
@@ -5134,7 +5134,7 @@
         <w:rPr>
           <w:sz w:val="22"/>
         </w:rPr>
-        <w:t>doctor / medico123  →  Rol Médico (sus citas y pacientes)</w:t>
+        <w:t>aldair_santos / Doctor@2024  →  Rol Médico (sus citas y pacientes)</w:t>
       </w:r>
     </w:p>
     <w:p>
@@ -5145,7 +5145,7 @@
         <w:rPr>
           <w:sz w:val="22"/>
         </w:rPr>
-        <w:t>paciente / cita123  →  Rol Paciente (solo sus citas, puede anular)</w:t>
+        <w:t>paola_medina / Paciente123  →  Rol Paciente (solo sus citas, puede anular)</w:t>
       </w:r>
     </w:p>
     <w:p>
@@ -5514,7 +5514,7 @@
         <w:rPr>
           <w:sz w:val="22"/>
         </w:rPr>
-        <w:t>Se implementó una API RESTful completa con .NET 8 y Entity Framework Core 8 conectada a una base de datos SQL Server real con 23 tablas relacionadas, superando la fase inicial de almacenamiento en memoria.</w:t>
+        <w:t>Se implementó una API RESTful completa con .NET 8 y Entity Framework Core 8 conectada a una base de datos SQL Server real con 24 tablas relacionadas, superando la fase inicial de almacenamiento en memoria.</w:t>
       </w:r>
     </w:p>
     <w:p>

</xml_diff>